<commit_message>
Resume: SOC Analyst II @ DigitalOcean (MNC)
</commit_message>
<xml_diff>
--- a/resumes/Resume_SOC_Analyst_II_DigitalOcean__MNC_.docx
+++ b/resumes/Resume_SOC_Analyst_II_DigitalOcean__MNC_.docx
@@ -583,7 +583,7 @@
           <w:sz w:val="19"/>
           <w:szCs w:val="19"/>
         </w:rPr>
-        <w:t>Developed SOAR-style detection pipeline: Python script ingests Splunk alerts, enriches with VirusTotal API, and dispatches Telegram notifications with severity classification.</w:t>
+        <w:t>Built automated SOAR-style detection pipeline: Python script ingests Splunk alerts, enriches with VirusTotal API, and dispatches Telegram notifications with severity classification.</w:t>
       </w:r>
     </w:p>
     <w:p>
@@ -672,7 +672,7 @@
           <w:sz w:val="19"/>
           <w:szCs w:val="19"/>
         </w:rPr>
-        <w:t>Built multi-API threat intelligence pipeline: submits suspicious data to VirusTotal, AbuseIPDB, and URLScan.io; cross-references WHOIS, DNS, and SSL details to produce a unified phishing probability score (EPSS 85).</w:t>
+        <w:t>Built multi-API threat intelligence pipeline: submits suspicious data to VirusTotal, AbuseIPDB, and URLScan.io; cross-references WHOIS, DNS, and SSL details for unified phishing probability score.</w:t>
       </w:r>
     </w:p>
     <w:p>
@@ -691,7 +691,7 @@
           <w:sz w:val="19"/>
           <w:szCs w:val="19"/>
         </w:rPr>
-        <w:t>Developed typosquatting detector generating domain variants and checking live DNS resolution to catch brand-impersonation attacks.</w:t>
+        <w:t>Developed typosquatting domain detector generating brand domain variants and checking live DNS resolution to catch brand-impersonation attacks early.</w:t>
       </w:r>
     </w:p>
     <w:p>

</xml_diff>